<commit_message>
Update testing log with Rich Content Suggestions tracking table
</commit_message>
<xml_diff>
--- a/resources/QBP_Tools_Testing_Log.docx
+++ b/resources/QBP_Tools_Testing_Log.docx
@@ -1,5 +1,27 @@
 
-<file path=word/document.xml><?xml version="1.0" encoding="utf-8"?>
+<file path=docProps\app.xml><?xml version="1.0" encoding="utf-8"?>
+<Properties xmlns="http://schemas.openxmlformats.org/officeDocument/2006/extended-properties" xmlns:vt="http://schemas.openxmlformats.org/officeDocument/2006/docPropsVTypes"/>
+</file>
+
+<file path=docProps\core.xml><?xml version="1.0" encoding="utf-8"?>
+<cp:coreProperties xmlns:cp="http://schemas.openxmlformats.org/package/2006/metadata/core-properties" xmlns:dc="http://purl.org/dc/elements/1.1/" xmlns:dcterms="http://purl.org/dc/terms/" xmlns:dcmitype="http://purl.org/dc/dcmitype/" xmlns:xsi="http://www.w3.org/2001/XMLSchema-instance">
+  <dc:creator>Un-named</dc:creator>
+  <cp:lastModifiedBy>Un-named</cp:lastModifiedBy>
+  <cp:revision>1</cp:revision>
+  <dcterms:created xsi:type="dcterms:W3CDTF">2026-03-18T20:09:46.478Z</dcterms:created>
+  <dcterms:modified xsi:type="dcterms:W3CDTF">2026-03-18T20:09:46.479Z</dcterms:modified>
+</cp:coreProperties>
+</file>
+
+<file path=docProps\custom.xml><?xml version="1.0" encoding="utf-8"?>
+<Properties xmlns="http://schemas.openxmlformats.org/officeDocument/2006/custom-properties" xmlns:vt="http://schemas.openxmlformats.org/officeDocument/2006/docPropsVTypes"/>
+</file>
+
+<file path=word\comments.xml><?xml version="1.0" encoding="utf-8"?>
+<w:comments xmlns:cx="http://schemas.microsoft.com/office/drawing/2014/chartex" xmlns:cx1="http://schemas.microsoft.com/office/drawing/2015/9/8/chartex" xmlns:cx2="http://schemas.microsoft.com/office/drawing/2015/10/21/chartex" xmlns:cx3="http://schemas.microsoft.com/office/drawing/2016/5/9/chartex" xmlns:cx4="http://schemas.microsoft.com/office/drawing/2016/5/10/chartex" xmlns:cx5="http://schemas.microsoft.com/office/drawing/2016/5/11/chartex" xmlns:cx6="http://schemas.microsoft.com/office/drawing/2016/5/12/chartex" xmlns:cx7="http://schemas.microsoft.com/office/drawing/2016/5/13/chartex" xmlns:cx8="http://schemas.microsoft.com/office/drawing/2016/5/14/chartex" xmlns:mc="http://schemas.openxmlformats.org/markup-compatibility/2006" xmlns:aink="http://schemas.microsoft.com/office/drawing/2016/ink" xmlns:am3d="http://schemas.microsoft.com/office/drawing/2017/model3d" xmlns:o="urn:schemas-microsoft-com:office:office" xmlns:r="http://schemas.openxmlformats.org/officeDocument/2006/relationships" xmlns:m="http://schemas.openxmlformats.org/officeDocument/2006/math" xmlns:v="urn:schemas-microsoft-com:vml" xmlns:wp14="http://schemas.microsoft.com/office/word/2010/wordprocessingDrawing" xmlns:wp="http://schemas.openxmlformats.org/drawingml/2006/wordprocessingDrawing" xmlns:w10="urn:schemas-microsoft-com:office:word" xmlns:w="http://schemas.openxmlformats.org/wordprocessingml/2006/main" xmlns:w14="http://schemas.microsoft.com/office/word/2010/wordml" xmlns:w15="http://schemas.microsoft.com/office/word/2012/wordml" xmlns:w16cex="http://schemas.microsoft.com/office/word/2018/wordml/cex" xmlns:w16cid="http://schemas.microsoft.com/office/word/2016/wordml/cid" xmlns:w16="http://schemas.microsoft.com/office/word/2018/wordml" xmlns:w16sdtdh="http://schemas.microsoft.com/office/word/2020/wordml/sdtdatahash" xmlns:w16se="http://schemas.microsoft.com/office/word/2015/wordml/symex" xmlns:wpg="http://schemas.microsoft.com/office/word/2010/wordprocessingGroup" xmlns:wpi="http://schemas.microsoft.com/office/word/2010/wordprocessingInk" xmlns:wne="http://schemas.microsoft.com/office/word/2006/wordml" xmlns:wps="http://schemas.microsoft.com/office/word/2010/wordprocessingShape"/>
+</file>
+
+<file path=word\document.xml><?xml version="1.0" encoding="utf-8"?>
 <w:document xmlns:wpc="http://schemas.microsoft.com/office/word/2010/wordprocessingCanvas" xmlns:mc="http://schemas.openxmlformats.org/markup-compatibility/2006" xmlns:o="urn:schemas-microsoft-com:office:office" xmlns:r="http://schemas.openxmlformats.org/officeDocument/2006/relationships" xmlns:m="http://schemas.openxmlformats.org/officeDocument/2006/math" xmlns:v="urn:schemas-microsoft-com:vml" xmlns:wp14="http://schemas.microsoft.com/office/word/2010/wordprocessingDrawing" xmlns:wp="http://schemas.openxmlformats.org/drawingml/2006/wordprocessingDrawing" xmlns:w10="urn:schemas-microsoft-com:office:word" xmlns:w="http://schemas.openxmlformats.org/wordprocessingml/2006/main" xmlns:w14="http://schemas.microsoft.com/office/word/2010/wordml" xmlns:w15="http://schemas.microsoft.com/office/word/2012/wordml" xmlns:wpg="http://schemas.microsoft.com/office/word/2010/wordprocessingGroup" xmlns:wpi="http://schemas.microsoft.com/office/word/2010/wordprocessingInk" xmlns:wne="http://schemas.microsoft.com/office/word/2006/wordml" xmlns:wps="http://schemas.microsoft.com/office/word/2010/wordprocessingShape" xmlns:cx="http://schemas.microsoft.com/office/drawing/2014/chartex" xmlns:cx1="http://schemas.microsoft.com/office/drawing/2015/9/8/chartex" xmlns:cx2="http://schemas.microsoft.com/office/drawing/2015/10/21/chartex" xmlns:cx3="http://schemas.microsoft.com/office/drawing/2016/5/9/chartex" xmlns:cx4="http://schemas.microsoft.com/office/drawing/2016/5/10/chartex" xmlns:cx5="http://schemas.microsoft.com/office/drawing/2016/5/11/chartex" xmlns:cx6="http://schemas.microsoft.com/office/drawing/2016/5/12/chartex" xmlns:cx7="http://schemas.microsoft.com/office/drawing/2016/5/13/chartex" xmlns:cx8="http://schemas.microsoft.com/office/drawing/2016/5/14/chartex" xmlns:aink="http://schemas.microsoft.com/office/drawing/2016/ink" xmlns:am3d="http://schemas.microsoft.com/office/drawing/2017/model3d" xmlns:w16cex="http://schemas.microsoft.com/office/word/2018/wordml/cex" xmlns:w16cid="http://schemas.microsoft.com/office/word/2016/wordml/cid" xmlns:w16="http://schemas.microsoft.com/office/word/2018/wordml" xmlns:w16sdtdh="http://schemas.microsoft.com/office/word/2020/wordml/sdtdatahash" xmlns:w16se="http://schemas.microsoft.com/office/word/2015/wordml/symex" mc:Ignorable="w14 w15 wp14">
   <w:body>
     <w:p>
@@ -9635,16 +9657,1267 @@
       <w:pgMar w:top="1080" w:right="1080" w:bottom="1080" w:left="1080" w:header="708" w:footer="708" w:gutter="0"/>
       <w:pgNumType/>
       <w:docGrid w:linePitch="360"/>
+      <w:p>
+        <w:pPr>
+          <w:spacing w:before="0" w:after="80"/>
+        </w:pPr>
+        <w:r>
+          <w:t xml:space="preserve"/>
+        </w:r>
+      </w:p>
+      <w:p>
+        <w:pPr>
+          <w:pStyle w:val="Heading1"/>
+          <w:pBdr>
+            <w:bottom w:val="single" w:color="2E75B6" w:sz="6" w:space="4"/>
+          </w:pBdr>
+          <w:spacing w:before="360" w:after="120"/>
+        </w:pPr>
+        <w:r>
+          <w:rPr>
+            <w:rFonts w:ascii="Arial" w:cs="Arial" w:eastAsia="Arial" w:hAnsi="Arial"/>
+            <w:b/>
+            <w:bCs/>
+            <w:color w:val="1A4F7A"/>
+            <w:sz w:val="28"/>
+            <w:szCs w:val="28"/>
+          </w:rPr>
+          <w:t xml:space="preserve">Rich Content Suggestions — Prompt Testing Log</w:t>
+        </w:r>
+      </w:p>
+      <w:p>
+        <w:pPr>
+          <w:spacing w:before="20" w:after="60"/>
+        </w:pPr>
+        <w:r>
+          <w:rPr>
+            <w:rFonts w:ascii="Arial" w:cs="Arial" w:eastAsia="Arial" w:hAnsi="Arial"/>
+            <w:sz w:val="20"/>
+            <w:szCs w:val="20"/>
+          </w:rPr>
+          <w:t xml:space="preserve">Use this table to log test runs of the Rich Content Suggestions output in the QBP Product Transformer. Paste good and bad examples so Claude can reference them for future prompt tuning.</w:t>
+        </w:r>
+      </w:p>
+      <w:p>
+        <w:pPr>
+          <w:spacing w:before="0" w:after="80"/>
+        </w:pPr>
+        <w:r>
+          <w:t xml:space="preserve"/>
+        </w:r>
+      </w:p>
+      <w:tbl>
+        <w:tblPr>
+          <w:tblW w:type="dxa" w:w="10080"/>
+          <w:tblBorders>
+            <w:top w:val="single" w:color="CCCCCC" w:sz="1"/>
+            <w:left w:val="single" w:color="CCCCCC" w:sz="1"/>
+            <w:bottom w:val="single" w:color="CCCCCC" w:sz="1"/>
+            <w:right w:val="single" w:color="CCCCCC" w:sz="1"/>
+            <w:insideH w:val="single" w:color="CCCCCC" w:sz="1"/>
+            <w:insideV w:val="single" w:color="CCCCCC" w:sz="1"/>
+          </w:tblBorders>
+          <w:tblLayout w:type="fixed"/>
+          <w:tblCellMar>
+            <w:top w:type="dxa" w:w="80"/>
+            <w:left w:type="dxa" w:w="120"/>
+            <w:bottom w:type="dxa" w:w="80"/>
+            <w:right w:type="dxa" w:w="120"/>
+          </w:tblCellMar>
+        </w:tblPr>
+        <w:tr>
+          <w:tc>
+            <w:tcPr>
+              <w:tcW w:type="dxa" w:w="900"/>
+              <w:tcBorders>
+                <w:top w:val="single" w:color="CCCCCC" w:sz="1"/>
+                <w:left w:val="single" w:color="CCCCCC" w:sz="1"/>
+                <w:bottom w:val="single" w:color="CCCCCC" w:sz="1"/>
+                <w:right w:val="single" w:color="CCCCCC" w:sz="1"/>
+              </w:tcBorders>
+              <w:shd w:fill="F5F5F2" w:val="clear"/>
+              <w:tcMar>
+                <w:top w:type="dxa" w:w="80"/>
+                <w:left w:type="dxa" w:w="120"/>
+                <w:bottom w:type="dxa" w:w="80"/>
+                <w:right w:type="dxa" w:w="120"/>
+              </w:tcMar>
+            </w:tcPr>
+            <w:p>
+              <w:r>
+                <w:rPr>
+                  <w:rFonts w:ascii="Arial" w:cs="Arial" w:eastAsia="Arial" w:hAnsi="Arial"/>
+                  <w:b/>
+                  <w:bCs/>
+                  <w:color w:val="1A1A1A"/>
+                  <w:sz w:val="18"/>
+                  <w:szCs w:val="18"/>
+                </w:rPr>
+                <w:t xml:space="preserve">Date</w:t>
+              </w:r>
+            </w:p>
+          </w:tc>
+          <w:tc>
+            <w:tcPr>
+              <w:tcW w:type="dxa" w:w="1600"/>
+              <w:tcBorders>
+                <w:top w:val="single" w:color="CCCCCC" w:sz="1"/>
+                <w:left w:val="single" w:color="CCCCCC" w:sz="1"/>
+                <w:bottom w:val="single" w:color="CCCCCC" w:sz="1"/>
+                <w:right w:val="single" w:color="CCCCCC" w:sz="1"/>
+              </w:tcBorders>
+              <w:shd w:fill="F5F5F2" w:val="clear"/>
+              <w:tcMar>
+                <w:top w:type="dxa" w:w="80"/>
+                <w:left w:type="dxa" w:w="120"/>
+                <w:bottom w:type="dxa" w:w="80"/>
+                <w:right w:type="dxa" w:w="120"/>
+              </w:tcMar>
+            </w:tcPr>
+            <w:p>
+              <w:r>
+                <w:rPr>
+                  <w:rFonts w:ascii="Arial" w:cs="Arial" w:eastAsia="Arial" w:hAnsi="Arial"/>
+                  <w:b/>
+                  <w:bCs/>
+                  <w:color w:val="1A1A1A"/>
+                  <w:sz w:val="18"/>
+                  <w:szCs w:val="18"/>
+                </w:rPr>
+                <w:t xml:space="preserve">Product Tested</w:t>
+              </w:r>
+            </w:p>
+          </w:tc>
+          <w:tc>
+            <w:tcPr>
+              <w:tcW w:type="dxa" w:w="1400"/>
+              <w:tcBorders>
+                <w:top w:val="single" w:color="CCCCCC" w:sz="1"/>
+                <w:left w:val="single" w:color="CCCCCC" w:sz="1"/>
+                <w:bottom w:val="single" w:color="CCCCCC" w:sz="1"/>
+                <w:right w:val="single" w:color="CCCCCC" w:sz="1"/>
+              </w:tcBorders>
+              <w:shd w:fill="F5F5F2" w:val="clear"/>
+              <w:tcMar>
+                <w:top w:type="dxa" w:w="80"/>
+                <w:left w:type="dxa" w:w="120"/>
+                <w:bottom w:type="dxa" w:w="80"/>
+                <w:right w:type="dxa" w:w="120"/>
+              </w:tcMar>
+            </w:tcPr>
+            <w:p>
+              <w:r>
+                <w:rPr>
+                  <w:rFonts w:ascii="Arial" w:cs="Arial" w:eastAsia="Arial" w:hAnsi="Arial"/>
+                  <w:b/>
+                  <w:bCs/>
+                  <w:color w:val="1A1A1A"/>
+                  <w:sz w:val="18"/>
+                  <w:szCs w:val="18"/>
+                </w:rPr>
+                <w:t xml:space="preserve">Source Quality (Rich / Moderate / Thin)</w:t>
+              </w:r>
+            </w:p>
+          </w:tc>
+          <w:tc>
+            <w:tcPr>
+              <w:tcW w:type="dxa" w:w="900"/>
+              <w:tcBorders>
+                <w:top w:val="single" w:color="CCCCCC" w:sz="1"/>
+                <w:left w:val="single" w:color="CCCCCC" w:sz="1"/>
+                <w:bottom w:val="single" w:color="CCCCCC" w:sz="1"/>
+                <w:right w:val="single" w:color="CCCCCC" w:sz="1"/>
+              </w:tcBorders>
+              <w:shd w:fill="F5F5F2" w:val="clear"/>
+              <w:tcMar>
+                <w:top w:type="dxa" w:w="80"/>
+                <w:left w:type="dxa" w:w="120"/>
+                <w:bottom w:type="dxa" w:w="80"/>
+                <w:right w:type="dxa" w:w="120"/>
+              </w:tcMar>
+            </w:tcPr>
+            <w:p>
+              <w:r>
+                <w:rPr>
+                  <w:rFonts w:ascii="Arial" w:cs="Arial" w:eastAsia="Arial" w:hAnsi="Arial"/>
+                  <w:b/>
+                  <w:bCs/>
+                  <w:color w:val="1A1A1A"/>
+                  <w:sz w:val="18"/>
+                  <w:szCs w:val="18"/>
+                </w:rPr>
+                <w:t xml:space="preserve">Output Rating (1–5)</w:t>
+              </w:r>
+            </w:p>
+          </w:tc>
+          <w:tc>
+            <w:tcPr>
+              <w:tcW w:type="dxa" w:w="1760"/>
+              <w:tcBorders>
+                <w:top w:val="single" w:color="CCCCCC" w:sz="1"/>
+                <w:left w:val="single" w:color="CCCCCC" w:sz="1"/>
+                <w:bottom w:val="single" w:color="CCCCCC" w:sz="1"/>
+                <w:right w:val="single" w:color="CCCCCC" w:sz="1"/>
+              </w:tcBorders>
+              <w:shd w:fill="F5F5F2" w:val="clear"/>
+              <w:tcMar>
+                <w:top w:type="dxa" w:w="80"/>
+                <w:left w:type="dxa" w:w="120"/>
+                <w:bottom w:type="dxa" w:w="80"/>
+                <w:right w:type="dxa" w:w="120"/>
+              </w:tcMar>
+            </w:tcPr>
+            <w:p>
+              <w:r>
+                <w:rPr>
+                  <w:rFonts w:ascii="Arial" w:cs="Arial" w:eastAsia="Arial" w:hAnsi="Arial"/>
+                  <w:b/>
+                  <w:bCs/>
+                  <w:color w:val="1A1A1A"/>
+                  <w:sz w:val="18"/>
+                  <w:szCs w:val="18"/>
+                </w:rPr>
+                <w:t xml:space="preserve">What Worked</w:t>
+              </w:r>
+            </w:p>
+          </w:tc>
+          <w:tc>
+            <w:tcPr>
+              <w:tcW w:type="dxa" w:w="1760"/>
+              <w:tcBorders>
+                <w:top w:val="single" w:color="CCCCCC" w:sz="1"/>
+                <w:left w:val="single" w:color="CCCCCC" w:sz="1"/>
+                <w:bottom w:val="single" w:color="CCCCCC" w:sz="1"/>
+                <w:right w:val="single" w:color="CCCCCC" w:sz="1"/>
+              </w:tcBorders>
+              <w:shd w:fill="F5F5F2" w:val="clear"/>
+              <w:tcMar>
+                <w:top w:type="dxa" w:w="80"/>
+                <w:left w:type="dxa" w:w="120"/>
+                <w:bottom w:type="dxa" w:w="80"/>
+                <w:right w:type="dxa" w:w="120"/>
+              </w:tcMar>
+            </w:tcPr>
+            <w:p>
+              <w:r>
+                <w:rPr>
+                  <w:rFonts w:ascii="Arial" w:cs="Arial" w:eastAsia="Arial" w:hAnsi="Arial"/>
+                  <w:b/>
+                  <w:bCs/>
+                  <w:color w:val="1A1A1A"/>
+                  <w:sz w:val="18"/>
+                  <w:szCs w:val="18"/>
+                </w:rPr>
+                <w:t xml:space="preserve">What Was Off</w:t>
+              </w:r>
+            </w:p>
+          </w:tc>
+          <w:tc>
+            <w:tcPr>
+              <w:tcW w:type="dxa" w:w="1760"/>
+              <w:tcBorders>
+                <w:top w:val="single" w:color="CCCCCC" w:sz="1"/>
+                <w:left w:val="single" w:color="CCCCCC" w:sz="1"/>
+                <w:bottom w:val="single" w:color="CCCCCC" w:sz="1"/>
+                <w:right w:val="single" w:color="CCCCCC" w:sz="1"/>
+              </w:tcBorders>
+              <w:shd w:fill="F5F5F2" w:val="clear"/>
+              <w:tcMar>
+                <w:top w:type="dxa" w:w="80"/>
+                <w:left w:type="dxa" w:w="120"/>
+                <w:bottom w:type="dxa" w:w="80"/>
+                <w:right w:type="dxa" w:w="120"/>
+              </w:tcMar>
+            </w:tcPr>
+            <w:p>
+              <w:r>
+                <w:rPr>
+                  <w:rFonts w:ascii="Arial" w:cs="Arial" w:eastAsia="Arial" w:hAnsi="Arial"/>
+                  <w:b/>
+                  <w:bCs/>
+                  <w:color w:val="1A1A1A"/>
+                  <w:sz w:val="18"/>
+                  <w:szCs w:val="18"/>
+                </w:rPr>
+                <w:t xml:space="preserve">Notes for Tuning</w:t>
+              </w:r>
+            </w:p>
+          </w:tc>
+        </w:tr>
+        <w:tr>
+          <w:tc>
+            <w:tcPr>
+              <w:tcW w:type="dxa" w:w="900"/>
+              <w:tcBorders>
+                <w:top w:val="single" w:color="CCCCCC" w:sz="1"/>
+                <w:left w:val="single" w:color="CCCCCC" w:sz="1"/>
+                <w:bottom w:val="single" w:color="CCCCCC" w:sz="1"/>
+                <w:right w:val="single" w:color="CCCCCC" w:sz="1"/>
+              </w:tcBorders>
+              <w:tcMar>
+                <w:top w:type="dxa" w:w="80"/>
+                <w:left w:type="dxa" w:w="120"/>
+                <w:bottom w:type="dxa" w:w="80"/>
+                <w:right w:type="dxa" w:w="120"/>
+              </w:tcMar>
+            </w:tcPr>
+            <w:p>
+              <w:r>
+                <w:rPr>
+                  <w:rFonts w:ascii="Arial" w:cs="Arial" w:eastAsia="Arial" w:hAnsi="Arial"/>
+                  <w:sz w:val="20"/>
+                  <w:szCs w:val="20"/>
+                </w:rPr>
+                <w:t xml:space="preserve"/>
+              </w:r>
+            </w:p>
+          </w:tc>
+          <w:tc>
+            <w:tcPr>
+              <w:tcW w:type="dxa" w:w="1600"/>
+              <w:tcBorders>
+                <w:top w:val="single" w:color="CCCCCC" w:sz="1"/>
+                <w:left w:val="single" w:color="CCCCCC" w:sz="1"/>
+                <w:bottom w:val="single" w:color="CCCCCC" w:sz="1"/>
+                <w:right w:val="single" w:color="CCCCCC" w:sz="1"/>
+              </w:tcBorders>
+              <w:tcMar>
+                <w:top w:type="dxa" w:w="80"/>
+                <w:left w:type="dxa" w:w="120"/>
+                <w:bottom w:type="dxa" w:w="80"/>
+                <w:right w:type="dxa" w:w="120"/>
+              </w:tcMar>
+            </w:tcPr>
+            <w:p>
+              <w:r>
+                <w:rPr>
+                  <w:rFonts w:ascii="Arial" w:cs="Arial" w:eastAsia="Arial" w:hAnsi="Arial"/>
+                  <w:sz w:val="20"/>
+                  <w:szCs w:val="20"/>
+                </w:rPr>
+                <w:t xml:space="preserve"/>
+              </w:r>
+            </w:p>
+          </w:tc>
+          <w:tc>
+            <w:tcPr>
+              <w:tcW w:type="dxa" w:w="1400"/>
+              <w:tcBorders>
+                <w:top w:val="single" w:color="CCCCCC" w:sz="1"/>
+                <w:left w:val="single" w:color="CCCCCC" w:sz="1"/>
+                <w:bottom w:val="single" w:color="CCCCCC" w:sz="1"/>
+                <w:right w:val="single" w:color="CCCCCC" w:sz="1"/>
+              </w:tcBorders>
+              <w:tcMar>
+                <w:top w:type="dxa" w:w="80"/>
+                <w:left w:type="dxa" w:w="120"/>
+                <w:bottom w:type="dxa" w:w="80"/>
+                <w:right w:type="dxa" w:w="120"/>
+              </w:tcMar>
+            </w:tcPr>
+            <w:p>
+              <w:r>
+                <w:rPr>
+                  <w:rFonts w:ascii="Arial" w:cs="Arial" w:eastAsia="Arial" w:hAnsi="Arial"/>
+                  <w:sz w:val="20"/>
+                  <w:szCs w:val="20"/>
+                </w:rPr>
+                <w:t xml:space="preserve"/>
+              </w:r>
+            </w:p>
+          </w:tc>
+          <w:tc>
+            <w:tcPr>
+              <w:tcW w:type="dxa" w:w="900"/>
+              <w:tcBorders>
+                <w:top w:val="single" w:color="CCCCCC" w:sz="1"/>
+                <w:left w:val="single" w:color="CCCCCC" w:sz="1"/>
+                <w:bottom w:val="single" w:color="CCCCCC" w:sz="1"/>
+                <w:right w:val="single" w:color="CCCCCC" w:sz="1"/>
+              </w:tcBorders>
+              <w:tcMar>
+                <w:top w:type="dxa" w:w="80"/>
+                <w:left w:type="dxa" w:w="120"/>
+                <w:bottom w:type="dxa" w:w="80"/>
+                <w:right w:type="dxa" w:w="120"/>
+              </w:tcMar>
+            </w:tcPr>
+            <w:p>
+              <w:r>
+                <w:rPr>
+                  <w:rFonts w:ascii="Arial" w:cs="Arial" w:eastAsia="Arial" w:hAnsi="Arial"/>
+                  <w:sz w:val="20"/>
+                  <w:szCs w:val="20"/>
+                </w:rPr>
+                <w:t xml:space="preserve"/>
+              </w:r>
+            </w:p>
+          </w:tc>
+          <w:tc>
+            <w:tcPr>
+              <w:tcW w:type="dxa" w:w="1760"/>
+              <w:tcBorders>
+                <w:top w:val="single" w:color="CCCCCC" w:sz="1"/>
+                <w:left w:val="single" w:color="CCCCCC" w:sz="1"/>
+                <w:bottom w:val="single" w:color="CCCCCC" w:sz="1"/>
+                <w:right w:val="single" w:color="CCCCCC" w:sz="1"/>
+              </w:tcBorders>
+              <w:tcMar>
+                <w:top w:type="dxa" w:w="80"/>
+                <w:left w:type="dxa" w:w="120"/>
+                <w:bottom w:type="dxa" w:w="80"/>
+                <w:right w:type="dxa" w:w="120"/>
+              </w:tcMar>
+            </w:tcPr>
+            <w:p>
+              <w:r>
+                <w:rPr>
+                  <w:rFonts w:ascii="Arial" w:cs="Arial" w:eastAsia="Arial" w:hAnsi="Arial"/>
+                  <w:sz w:val="20"/>
+                  <w:szCs w:val="20"/>
+                </w:rPr>
+                <w:t xml:space="preserve"/>
+              </w:r>
+            </w:p>
+          </w:tc>
+          <w:tc>
+            <w:tcPr>
+              <w:tcW w:type="dxa" w:w="1760"/>
+              <w:tcBorders>
+                <w:top w:val="single" w:color="CCCCCC" w:sz="1"/>
+                <w:left w:val="single" w:color="CCCCCC" w:sz="1"/>
+                <w:bottom w:val="single" w:color="CCCCCC" w:sz="1"/>
+                <w:right w:val="single" w:color="CCCCCC" w:sz="1"/>
+              </w:tcBorders>
+              <w:tcMar>
+                <w:top w:type="dxa" w:w="80"/>
+                <w:left w:type="dxa" w:w="120"/>
+                <w:bottom w:type="dxa" w:w="80"/>
+                <w:right w:type="dxa" w:w="120"/>
+              </w:tcMar>
+            </w:tcPr>
+            <w:p>
+              <w:r>
+                <w:rPr>
+                  <w:rFonts w:ascii="Arial" w:cs="Arial" w:eastAsia="Arial" w:hAnsi="Arial"/>
+                  <w:sz w:val="20"/>
+                  <w:szCs w:val="20"/>
+                </w:rPr>
+                <w:t xml:space="preserve"/>
+              </w:r>
+            </w:p>
+          </w:tc>
+          <w:tc>
+            <w:tcPr>
+              <w:tcW w:type="dxa" w:w="1760"/>
+              <w:tcBorders>
+                <w:top w:val="single" w:color="CCCCCC" w:sz="1"/>
+                <w:left w:val="single" w:color="CCCCCC" w:sz="1"/>
+                <w:bottom w:val="single" w:color="CCCCCC" w:sz="1"/>
+                <w:right w:val="single" w:color="CCCCCC" w:sz="1"/>
+              </w:tcBorders>
+              <w:tcMar>
+                <w:top w:type="dxa" w:w="80"/>
+                <w:left w:type="dxa" w:w="120"/>
+                <w:bottom w:type="dxa" w:w="80"/>
+                <w:right w:type="dxa" w:w="120"/>
+              </w:tcMar>
+            </w:tcPr>
+            <w:p>
+              <w:r>
+                <w:rPr>
+                  <w:rFonts w:ascii="Arial" w:cs="Arial" w:eastAsia="Arial" w:hAnsi="Arial"/>
+                  <w:sz w:val="20"/>
+                  <w:szCs w:val="20"/>
+                </w:rPr>
+                <w:t xml:space="preserve"/>
+              </w:r>
+            </w:p>
+          </w:tc>
+        </w:tr>
+        <w:tr>
+          <w:tc>
+            <w:tcPr>
+              <w:tcW w:type="dxa" w:w="900"/>
+              <w:tcBorders>
+                <w:top w:val="single" w:color="CCCCCC" w:sz="1"/>
+                <w:left w:val="single" w:color="CCCCCC" w:sz="1"/>
+                <w:bottom w:val="single" w:color="CCCCCC" w:sz="1"/>
+                <w:right w:val="single" w:color="CCCCCC" w:sz="1"/>
+              </w:tcBorders>
+              <w:tcMar>
+                <w:top w:type="dxa" w:w="80"/>
+                <w:left w:type="dxa" w:w="120"/>
+                <w:bottom w:type="dxa" w:w="80"/>
+                <w:right w:type="dxa" w:w="120"/>
+              </w:tcMar>
+            </w:tcPr>
+            <w:p>
+              <w:r>
+                <w:rPr>
+                  <w:rFonts w:ascii="Arial" w:cs="Arial" w:eastAsia="Arial" w:hAnsi="Arial"/>
+                  <w:sz w:val="20"/>
+                  <w:szCs w:val="20"/>
+                </w:rPr>
+                <w:t xml:space="preserve"/>
+              </w:r>
+            </w:p>
+          </w:tc>
+          <w:tc>
+            <w:tcPr>
+              <w:tcW w:type="dxa" w:w="1600"/>
+              <w:tcBorders>
+                <w:top w:val="single" w:color="CCCCCC" w:sz="1"/>
+                <w:left w:val="single" w:color="CCCCCC" w:sz="1"/>
+                <w:bottom w:val="single" w:color="CCCCCC" w:sz="1"/>
+                <w:right w:val="single" w:color="CCCCCC" w:sz="1"/>
+              </w:tcBorders>
+              <w:tcMar>
+                <w:top w:type="dxa" w:w="80"/>
+                <w:left w:type="dxa" w:w="120"/>
+                <w:bottom w:type="dxa" w:w="80"/>
+                <w:right w:type="dxa" w:w="120"/>
+              </w:tcMar>
+            </w:tcPr>
+            <w:p>
+              <w:r>
+                <w:rPr>
+                  <w:rFonts w:ascii="Arial" w:cs="Arial" w:eastAsia="Arial" w:hAnsi="Arial"/>
+                  <w:sz w:val="20"/>
+                  <w:szCs w:val="20"/>
+                </w:rPr>
+                <w:t xml:space="preserve"/>
+              </w:r>
+            </w:p>
+          </w:tc>
+          <w:tc>
+            <w:tcPr>
+              <w:tcW w:type="dxa" w:w="1400"/>
+              <w:tcBorders>
+                <w:top w:val="single" w:color="CCCCCC" w:sz="1"/>
+                <w:left w:val="single" w:color="CCCCCC" w:sz="1"/>
+                <w:bottom w:val="single" w:color="CCCCCC" w:sz="1"/>
+                <w:right w:val="single" w:color="CCCCCC" w:sz="1"/>
+              </w:tcBorders>
+              <w:tcMar>
+                <w:top w:type="dxa" w:w="80"/>
+                <w:left w:type="dxa" w:w="120"/>
+                <w:bottom w:type="dxa" w:w="80"/>
+                <w:right w:type="dxa" w:w="120"/>
+              </w:tcMar>
+            </w:tcPr>
+            <w:p>
+              <w:r>
+                <w:rPr>
+                  <w:rFonts w:ascii="Arial" w:cs="Arial" w:eastAsia="Arial" w:hAnsi="Arial"/>
+                  <w:sz w:val="20"/>
+                  <w:szCs w:val="20"/>
+                </w:rPr>
+                <w:t xml:space="preserve"/>
+              </w:r>
+            </w:p>
+          </w:tc>
+          <w:tc>
+            <w:tcPr>
+              <w:tcW w:type="dxa" w:w="900"/>
+              <w:tcBorders>
+                <w:top w:val="single" w:color="CCCCCC" w:sz="1"/>
+                <w:left w:val="single" w:color="CCCCCC" w:sz="1"/>
+                <w:bottom w:val="single" w:color="CCCCCC" w:sz="1"/>
+                <w:right w:val="single" w:color="CCCCCC" w:sz="1"/>
+              </w:tcBorders>
+              <w:tcMar>
+                <w:top w:type="dxa" w:w="80"/>
+                <w:left w:type="dxa" w:w="120"/>
+                <w:bottom w:type="dxa" w:w="80"/>
+                <w:right w:type="dxa" w:w="120"/>
+              </w:tcMar>
+            </w:tcPr>
+            <w:p>
+              <w:r>
+                <w:rPr>
+                  <w:rFonts w:ascii="Arial" w:cs="Arial" w:eastAsia="Arial" w:hAnsi="Arial"/>
+                  <w:sz w:val="20"/>
+                  <w:szCs w:val="20"/>
+                </w:rPr>
+                <w:t xml:space="preserve"/>
+              </w:r>
+            </w:p>
+          </w:tc>
+          <w:tc>
+            <w:tcPr>
+              <w:tcW w:type="dxa" w:w="1760"/>
+              <w:tcBorders>
+                <w:top w:val="single" w:color="CCCCCC" w:sz="1"/>
+                <w:left w:val="single" w:color="CCCCCC" w:sz="1"/>
+                <w:bottom w:val="single" w:color="CCCCCC" w:sz="1"/>
+                <w:right w:val="single" w:color="CCCCCC" w:sz="1"/>
+              </w:tcBorders>
+              <w:tcMar>
+                <w:top w:type="dxa" w:w="80"/>
+                <w:left w:type="dxa" w:w="120"/>
+                <w:bottom w:type="dxa" w:w="80"/>
+                <w:right w:type="dxa" w:w="120"/>
+              </w:tcMar>
+            </w:tcPr>
+            <w:p>
+              <w:r>
+                <w:rPr>
+                  <w:rFonts w:ascii="Arial" w:cs="Arial" w:eastAsia="Arial" w:hAnsi="Arial"/>
+                  <w:sz w:val="20"/>
+                  <w:szCs w:val="20"/>
+                </w:rPr>
+                <w:t xml:space="preserve"/>
+              </w:r>
+            </w:p>
+          </w:tc>
+          <w:tc>
+            <w:tcPr>
+              <w:tcW w:type="dxa" w:w="1760"/>
+              <w:tcBorders>
+                <w:top w:val="single" w:color="CCCCCC" w:sz="1"/>
+                <w:left w:val="single" w:color="CCCCCC" w:sz="1"/>
+                <w:bottom w:val="single" w:color="CCCCCC" w:sz="1"/>
+                <w:right w:val="single" w:color="CCCCCC" w:sz="1"/>
+              </w:tcBorders>
+              <w:tcMar>
+                <w:top w:type="dxa" w:w="80"/>
+                <w:left w:type="dxa" w:w="120"/>
+                <w:bottom w:type="dxa" w:w="80"/>
+                <w:right w:type="dxa" w:w="120"/>
+              </w:tcMar>
+            </w:tcPr>
+            <w:p>
+              <w:r>
+                <w:rPr>
+                  <w:rFonts w:ascii="Arial" w:cs="Arial" w:eastAsia="Arial" w:hAnsi="Arial"/>
+                  <w:sz w:val="20"/>
+                  <w:szCs w:val="20"/>
+                </w:rPr>
+                <w:t xml:space="preserve"/>
+              </w:r>
+            </w:p>
+          </w:tc>
+          <w:tc>
+            <w:tcPr>
+              <w:tcW w:type="dxa" w:w="1760"/>
+              <w:tcBorders>
+                <w:top w:val="single" w:color="CCCCCC" w:sz="1"/>
+                <w:left w:val="single" w:color="CCCCCC" w:sz="1"/>
+                <w:bottom w:val="single" w:color="CCCCCC" w:sz="1"/>
+                <w:right w:val="single" w:color="CCCCCC" w:sz="1"/>
+              </w:tcBorders>
+              <w:tcMar>
+                <w:top w:type="dxa" w:w="80"/>
+                <w:left w:type="dxa" w:w="120"/>
+                <w:bottom w:type="dxa" w:w="80"/>
+                <w:right w:type="dxa" w:w="120"/>
+              </w:tcMar>
+            </w:tcPr>
+            <w:p>
+              <w:r>
+                <w:rPr>
+                  <w:rFonts w:ascii="Arial" w:cs="Arial" w:eastAsia="Arial" w:hAnsi="Arial"/>
+                  <w:sz w:val="20"/>
+                  <w:szCs w:val="20"/>
+                </w:rPr>
+                <w:t xml:space="preserve"/>
+              </w:r>
+            </w:p>
+          </w:tc>
+        </w:tr>
+        <w:tr>
+          <w:tc>
+            <w:tcPr>
+              <w:tcW w:type="dxa" w:w="900"/>
+              <w:tcBorders>
+                <w:top w:val="single" w:color="CCCCCC" w:sz="1"/>
+                <w:left w:val="single" w:color="CCCCCC" w:sz="1"/>
+                <w:bottom w:val="single" w:color="CCCCCC" w:sz="1"/>
+                <w:right w:val="single" w:color="CCCCCC" w:sz="1"/>
+              </w:tcBorders>
+              <w:tcMar>
+                <w:top w:type="dxa" w:w="80"/>
+                <w:left w:type="dxa" w:w="120"/>
+                <w:bottom w:type="dxa" w:w="80"/>
+                <w:right w:type="dxa" w:w="120"/>
+              </w:tcMar>
+            </w:tcPr>
+            <w:p>
+              <w:r>
+                <w:rPr>
+                  <w:rFonts w:ascii="Arial" w:cs="Arial" w:eastAsia="Arial" w:hAnsi="Arial"/>
+                  <w:sz w:val="20"/>
+                  <w:szCs w:val="20"/>
+                </w:rPr>
+                <w:t xml:space="preserve"/>
+              </w:r>
+            </w:p>
+          </w:tc>
+          <w:tc>
+            <w:tcPr>
+              <w:tcW w:type="dxa" w:w="1600"/>
+              <w:tcBorders>
+                <w:top w:val="single" w:color="CCCCCC" w:sz="1"/>
+                <w:left w:val="single" w:color="CCCCCC" w:sz="1"/>
+                <w:bottom w:val="single" w:color="CCCCCC" w:sz="1"/>
+                <w:right w:val="single" w:color="CCCCCC" w:sz="1"/>
+              </w:tcBorders>
+              <w:tcMar>
+                <w:top w:type="dxa" w:w="80"/>
+                <w:left w:type="dxa" w:w="120"/>
+                <w:bottom w:type="dxa" w:w="80"/>
+                <w:right w:type="dxa" w:w="120"/>
+              </w:tcMar>
+            </w:tcPr>
+            <w:p>
+              <w:r>
+                <w:rPr>
+                  <w:rFonts w:ascii="Arial" w:cs="Arial" w:eastAsia="Arial" w:hAnsi="Arial"/>
+                  <w:sz w:val="20"/>
+                  <w:szCs w:val="20"/>
+                </w:rPr>
+                <w:t xml:space="preserve"/>
+              </w:r>
+            </w:p>
+          </w:tc>
+          <w:tc>
+            <w:tcPr>
+              <w:tcW w:type="dxa" w:w="1400"/>
+              <w:tcBorders>
+                <w:top w:val="single" w:color="CCCCCC" w:sz="1"/>
+                <w:left w:val="single" w:color="CCCCCC" w:sz="1"/>
+                <w:bottom w:val="single" w:color="CCCCCC" w:sz="1"/>
+                <w:right w:val="single" w:color="CCCCCC" w:sz="1"/>
+              </w:tcBorders>
+              <w:tcMar>
+                <w:top w:type="dxa" w:w="80"/>
+                <w:left w:type="dxa" w:w="120"/>
+                <w:bottom w:type="dxa" w:w="80"/>
+                <w:right w:type="dxa" w:w="120"/>
+              </w:tcMar>
+            </w:tcPr>
+            <w:p>
+              <w:r>
+                <w:rPr>
+                  <w:rFonts w:ascii="Arial" w:cs="Arial" w:eastAsia="Arial" w:hAnsi="Arial"/>
+                  <w:sz w:val="20"/>
+                  <w:szCs w:val="20"/>
+                </w:rPr>
+                <w:t xml:space="preserve"/>
+              </w:r>
+            </w:p>
+          </w:tc>
+          <w:tc>
+            <w:tcPr>
+              <w:tcW w:type="dxa" w:w="900"/>
+              <w:tcBorders>
+                <w:top w:val="single" w:color="CCCCCC" w:sz="1"/>
+                <w:left w:val="single" w:color="CCCCCC" w:sz="1"/>
+                <w:bottom w:val="single" w:color="CCCCCC" w:sz="1"/>
+                <w:right w:val="single" w:color="CCCCCC" w:sz="1"/>
+              </w:tcBorders>
+              <w:tcMar>
+                <w:top w:type="dxa" w:w="80"/>
+                <w:left w:type="dxa" w:w="120"/>
+                <w:bottom w:type="dxa" w:w="80"/>
+                <w:right w:type="dxa" w:w="120"/>
+              </w:tcMar>
+            </w:tcPr>
+            <w:p>
+              <w:r>
+                <w:rPr>
+                  <w:rFonts w:ascii="Arial" w:cs="Arial" w:eastAsia="Arial" w:hAnsi="Arial"/>
+                  <w:sz w:val="20"/>
+                  <w:szCs w:val="20"/>
+                </w:rPr>
+                <w:t xml:space="preserve"/>
+              </w:r>
+            </w:p>
+          </w:tc>
+          <w:tc>
+            <w:tcPr>
+              <w:tcW w:type="dxa" w:w="1760"/>
+              <w:tcBorders>
+                <w:top w:val="single" w:color="CCCCCC" w:sz="1"/>
+                <w:left w:val="single" w:color="CCCCCC" w:sz="1"/>
+                <w:bottom w:val="single" w:color="CCCCCC" w:sz="1"/>
+                <w:right w:val="single" w:color="CCCCCC" w:sz="1"/>
+              </w:tcBorders>
+              <w:tcMar>
+                <w:top w:type="dxa" w:w="80"/>
+                <w:left w:type="dxa" w:w="120"/>
+                <w:bottom w:type="dxa" w:w="80"/>
+                <w:right w:type="dxa" w:w="120"/>
+              </w:tcMar>
+            </w:tcPr>
+            <w:p>
+              <w:r>
+                <w:rPr>
+                  <w:rFonts w:ascii="Arial" w:cs="Arial" w:eastAsia="Arial" w:hAnsi="Arial"/>
+                  <w:sz w:val="20"/>
+                  <w:szCs w:val="20"/>
+                </w:rPr>
+                <w:t xml:space="preserve"/>
+              </w:r>
+            </w:p>
+          </w:tc>
+          <w:tc>
+            <w:tcPr>
+              <w:tcW w:type="dxa" w:w="1760"/>
+              <w:tcBorders>
+                <w:top w:val="single" w:color="CCCCCC" w:sz="1"/>
+                <w:left w:val="single" w:color="CCCCCC" w:sz="1"/>
+                <w:bottom w:val="single" w:color="CCCCCC" w:sz="1"/>
+                <w:right w:val="single" w:color="CCCCCC" w:sz="1"/>
+              </w:tcBorders>
+              <w:tcMar>
+                <w:top w:type="dxa" w:w="80"/>
+                <w:left w:type="dxa" w:w="120"/>
+                <w:bottom w:type="dxa" w:w="80"/>
+                <w:right w:type="dxa" w:w="120"/>
+              </w:tcMar>
+            </w:tcPr>
+            <w:p>
+              <w:r>
+                <w:rPr>
+                  <w:rFonts w:ascii="Arial" w:cs="Arial" w:eastAsia="Arial" w:hAnsi="Arial"/>
+                  <w:sz w:val="20"/>
+                  <w:szCs w:val="20"/>
+                </w:rPr>
+                <w:t xml:space="preserve"/>
+              </w:r>
+            </w:p>
+          </w:tc>
+          <w:tc>
+            <w:tcPr>
+              <w:tcW w:type="dxa" w:w="1760"/>
+              <w:tcBorders>
+                <w:top w:val="single" w:color="CCCCCC" w:sz="1"/>
+                <w:left w:val="single" w:color="CCCCCC" w:sz="1"/>
+                <w:bottom w:val="single" w:color="CCCCCC" w:sz="1"/>
+                <w:right w:val="single" w:color="CCCCCC" w:sz="1"/>
+              </w:tcBorders>
+              <w:tcMar>
+                <w:top w:type="dxa" w:w="80"/>
+                <w:left w:type="dxa" w:w="120"/>
+                <w:bottom w:type="dxa" w:w="80"/>
+                <w:right w:type="dxa" w:w="120"/>
+              </w:tcMar>
+            </w:tcPr>
+            <w:p>
+              <w:r>
+                <w:rPr>
+                  <w:rFonts w:ascii="Arial" w:cs="Arial" w:eastAsia="Arial" w:hAnsi="Arial"/>
+                  <w:sz w:val="20"/>
+                  <w:szCs w:val="20"/>
+                </w:rPr>
+                <w:t xml:space="preserve"/>
+              </w:r>
+            </w:p>
+          </w:tc>
+        </w:tr>
+        <w:tr>
+          <w:tc>
+            <w:tcPr>
+              <w:tcW w:type="dxa" w:w="900"/>
+              <w:tcBorders>
+                <w:top w:val="single" w:color="CCCCCC" w:sz="1"/>
+                <w:left w:val="single" w:color="CCCCCC" w:sz="1"/>
+                <w:bottom w:val="single" w:color="CCCCCC" w:sz="1"/>
+                <w:right w:val="single" w:color="CCCCCC" w:sz="1"/>
+              </w:tcBorders>
+              <w:tcMar>
+                <w:top w:type="dxa" w:w="80"/>
+                <w:left w:type="dxa" w:w="120"/>
+                <w:bottom w:type="dxa" w:w="80"/>
+                <w:right w:type="dxa" w:w="120"/>
+              </w:tcMar>
+            </w:tcPr>
+            <w:p>
+              <w:r>
+                <w:rPr>
+                  <w:rFonts w:ascii="Arial" w:cs="Arial" w:eastAsia="Arial" w:hAnsi="Arial"/>
+                  <w:sz w:val="20"/>
+                  <w:szCs w:val="20"/>
+                </w:rPr>
+                <w:t xml:space="preserve"/>
+              </w:r>
+            </w:p>
+          </w:tc>
+          <w:tc>
+            <w:tcPr>
+              <w:tcW w:type="dxa" w:w="1600"/>
+              <w:tcBorders>
+                <w:top w:val="single" w:color="CCCCCC" w:sz="1"/>
+                <w:left w:val="single" w:color="CCCCCC" w:sz="1"/>
+                <w:bottom w:val="single" w:color="CCCCCC" w:sz="1"/>
+                <w:right w:val="single" w:color="CCCCCC" w:sz="1"/>
+              </w:tcBorders>
+              <w:tcMar>
+                <w:top w:type="dxa" w:w="80"/>
+                <w:left w:type="dxa" w:w="120"/>
+                <w:bottom w:type="dxa" w:w="80"/>
+                <w:right w:type="dxa" w:w="120"/>
+              </w:tcMar>
+            </w:tcPr>
+            <w:p>
+              <w:r>
+                <w:rPr>
+                  <w:rFonts w:ascii="Arial" w:cs="Arial" w:eastAsia="Arial" w:hAnsi="Arial"/>
+                  <w:sz w:val="20"/>
+                  <w:szCs w:val="20"/>
+                </w:rPr>
+                <w:t xml:space="preserve"/>
+              </w:r>
+            </w:p>
+          </w:tc>
+          <w:tc>
+            <w:tcPr>
+              <w:tcW w:type="dxa" w:w="1400"/>
+              <w:tcBorders>
+                <w:top w:val="single" w:color="CCCCCC" w:sz="1"/>
+                <w:left w:val="single" w:color="CCCCCC" w:sz="1"/>
+                <w:bottom w:val="single" w:color="CCCCCC" w:sz="1"/>
+                <w:right w:val="single" w:color="CCCCCC" w:sz="1"/>
+              </w:tcBorders>
+              <w:tcMar>
+                <w:top w:type="dxa" w:w="80"/>
+                <w:left w:type="dxa" w:w="120"/>
+                <w:bottom w:type="dxa" w:w="80"/>
+                <w:right w:type="dxa" w:w="120"/>
+              </w:tcMar>
+            </w:tcPr>
+            <w:p>
+              <w:r>
+                <w:rPr>
+                  <w:rFonts w:ascii="Arial" w:cs="Arial" w:eastAsia="Arial" w:hAnsi="Arial"/>
+                  <w:sz w:val="20"/>
+                  <w:szCs w:val="20"/>
+                </w:rPr>
+                <w:t xml:space="preserve"/>
+              </w:r>
+            </w:p>
+          </w:tc>
+          <w:tc>
+            <w:tcPr>
+              <w:tcW w:type="dxa" w:w="900"/>
+              <w:tcBorders>
+                <w:top w:val="single" w:color="CCCCCC" w:sz="1"/>
+                <w:left w:val="single" w:color="CCCCCC" w:sz="1"/>
+                <w:bottom w:val="single" w:color="CCCCCC" w:sz="1"/>
+                <w:right w:val="single" w:color="CCCCCC" w:sz="1"/>
+              </w:tcBorders>
+              <w:tcMar>
+                <w:top w:type="dxa" w:w="80"/>
+                <w:left w:type="dxa" w:w="120"/>
+                <w:bottom w:type="dxa" w:w="80"/>
+                <w:right w:type="dxa" w:w="120"/>
+              </w:tcMar>
+            </w:tcPr>
+            <w:p>
+              <w:r>
+                <w:rPr>
+                  <w:rFonts w:ascii="Arial" w:cs="Arial" w:eastAsia="Arial" w:hAnsi="Arial"/>
+                  <w:sz w:val="20"/>
+                  <w:szCs w:val="20"/>
+                </w:rPr>
+                <w:t xml:space="preserve"/>
+              </w:r>
+            </w:p>
+          </w:tc>
+          <w:tc>
+            <w:tcPr>
+              <w:tcW w:type="dxa" w:w="1760"/>
+              <w:tcBorders>
+                <w:top w:val="single" w:color="CCCCCC" w:sz="1"/>
+                <w:left w:val="single" w:color="CCCCCC" w:sz="1"/>
+                <w:bottom w:val="single" w:color="CCCCCC" w:sz="1"/>
+                <w:right w:val="single" w:color="CCCCCC" w:sz="1"/>
+              </w:tcBorders>
+              <w:tcMar>
+                <w:top w:type="dxa" w:w="80"/>
+                <w:left w:type="dxa" w:w="120"/>
+                <w:bottom w:type="dxa" w:w="80"/>
+                <w:right w:type="dxa" w:w="120"/>
+              </w:tcMar>
+            </w:tcPr>
+            <w:p>
+              <w:r>
+                <w:rPr>
+                  <w:rFonts w:ascii="Arial" w:cs="Arial" w:eastAsia="Arial" w:hAnsi="Arial"/>
+                  <w:sz w:val="20"/>
+                  <w:szCs w:val="20"/>
+                </w:rPr>
+                <w:t xml:space="preserve"/>
+              </w:r>
+            </w:p>
+          </w:tc>
+          <w:tc>
+            <w:tcPr>
+              <w:tcW w:type="dxa" w:w="1760"/>
+              <w:tcBorders>
+                <w:top w:val="single" w:color="CCCCCC" w:sz="1"/>
+                <w:left w:val="single" w:color="CCCCCC" w:sz="1"/>
+                <w:bottom w:val="single" w:color="CCCCCC" w:sz="1"/>
+                <w:right w:val="single" w:color="CCCCCC" w:sz="1"/>
+              </w:tcBorders>
+              <w:tcMar>
+                <w:top w:type="dxa" w:w="80"/>
+                <w:left w:type="dxa" w:w="120"/>
+                <w:bottom w:type="dxa" w:w="80"/>
+                <w:right w:type="dxa" w:w="120"/>
+              </w:tcMar>
+            </w:tcPr>
+            <w:p>
+              <w:r>
+                <w:rPr>
+                  <w:rFonts w:ascii="Arial" w:cs="Arial" w:eastAsia="Arial" w:hAnsi="Arial"/>
+                  <w:sz w:val="20"/>
+                  <w:szCs w:val="20"/>
+                </w:rPr>
+                <w:t xml:space="preserve"/>
+              </w:r>
+            </w:p>
+          </w:tc>
+          <w:tc>
+            <w:tcPr>
+              <w:tcW w:type="dxa" w:w="1760"/>
+              <w:tcBorders>
+                <w:top w:val="single" w:color="CCCCCC" w:sz="1"/>
+                <w:left w:val="single" w:color="CCCCCC" w:sz="1"/>
+                <w:bottom w:val="single" w:color="CCCCCC" w:sz="1"/>
+                <w:right w:val="single" w:color="CCCCCC" w:sz="1"/>
+              </w:tcBorders>
+              <w:tcMar>
+                <w:top w:type="dxa" w:w="80"/>
+                <w:left w:type="dxa" w:w="120"/>
+                <w:bottom w:type="dxa" w:w="80"/>
+                <w:right w:type="dxa" w:w="120"/>
+              </w:tcMar>
+            </w:tcPr>
+            <w:p>
+              <w:r>
+                <w:rPr>
+                  <w:rFonts w:ascii="Arial" w:cs="Arial" w:eastAsia="Arial" w:hAnsi="Arial"/>
+                  <w:sz w:val="20"/>
+                  <w:szCs w:val="20"/>
+                </w:rPr>
+                <w:t xml:space="preserve"/>
+              </w:r>
+            </w:p>
+          </w:tc>
+        </w:tr>
+        <w:tr>
+          <w:tc>
+            <w:tcPr>
+              <w:tcW w:type="dxa" w:w="900"/>
+              <w:tcBorders>
+                <w:top w:val="single" w:color="CCCCCC" w:sz="1"/>
+                <w:left w:val="single" w:color="CCCCCC" w:sz="1"/>
+                <w:bottom w:val="single" w:color="CCCCCC" w:sz="1"/>
+                <w:right w:val="single" w:color="CCCCCC" w:sz="1"/>
+              </w:tcBorders>
+              <w:tcMar>
+                <w:top w:type="dxa" w:w="80"/>
+                <w:left w:type="dxa" w:w="120"/>
+                <w:bottom w:type="dxa" w:w="80"/>
+                <w:right w:type="dxa" w:w="120"/>
+              </w:tcMar>
+            </w:tcPr>
+            <w:p>
+              <w:r>
+                <w:rPr>
+                  <w:rFonts w:ascii="Arial" w:cs="Arial" w:eastAsia="Arial" w:hAnsi="Arial"/>
+                  <w:sz w:val="20"/>
+                  <w:szCs w:val="20"/>
+                </w:rPr>
+                <w:t xml:space="preserve"/>
+              </w:r>
+            </w:p>
+          </w:tc>
+          <w:tc>
+            <w:tcPr>
+              <w:tcW w:type="dxa" w:w="1600"/>
+              <w:tcBorders>
+                <w:top w:val="single" w:color="CCCCCC" w:sz="1"/>
+                <w:left w:val="single" w:color="CCCCCC" w:sz="1"/>
+                <w:bottom w:val="single" w:color="CCCCCC" w:sz="1"/>
+                <w:right w:val="single" w:color="CCCCCC" w:sz="1"/>
+              </w:tcBorders>
+              <w:tcMar>
+                <w:top w:type="dxa" w:w="80"/>
+                <w:left w:type="dxa" w:w="120"/>
+                <w:bottom w:type="dxa" w:w="80"/>
+                <w:right w:type="dxa" w:w="120"/>
+              </w:tcMar>
+            </w:tcPr>
+            <w:p>
+              <w:r>
+                <w:rPr>
+                  <w:rFonts w:ascii="Arial" w:cs="Arial" w:eastAsia="Arial" w:hAnsi="Arial"/>
+                  <w:sz w:val="20"/>
+                  <w:szCs w:val="20"/>
+                </w:rPr>
+                <w:t xml:space="preserve"/>
+              </w:r>
+            </w:p>
+          </w:tc>
+          <w:tc>
+            <w:tcPr>
+              <w:tcW w:type="dxa" w:w="1400"/>
+              <w:tcBorders>
+                <w:top w:val="single" w:color="CCCCCC" w:sz="1"/>
+                <w:left w:val="single" w:color="CCCCCC" w:sz="1"/>
+                <w:bottom w:val="single" w:color="CCCCCC" w:sz="1"/>
+                <w:right w:val="single" w:color="CCCCCC" w:sz="1"/>
+              </w:tcBorders>
+              <w:tcMar>
+                <w:top w:type="dxa" w:w="80"/>
+                <w:left w:type="dxa" w:w="120"/>
+                <w:bottom w:type="dxa" w:w="80"/>
+                <w:right w:type="dxa" w:w="120"/>
+              </w:tcMar>
+            </w:tcPr>
+            <w:p>
+              <w:r>
+                <w:rPr>
+                  <w:rFonts w:ascii="Arial" w:cs="Arial" w:eastAsia="Arial" w:hAnsi="Arial"/>
+                  <w:sz w:val="20"/>
+                  <w:szCs w:val="20"/>
+                </w:rPr>
+                <w:t xml:space="preserve"/>
+              </w:r>
+            </w:p>
+          </w:tc>
+          <w:tc>
+            <w:tcPr>
+              <w:tcW w:type="dxa" w:w="900"/>
+              <w:tcBorders>
+                <w:top w:val="single" w:color="CCCCCC" w:sz="1"/>
+                <w:left w:val="single" w:color="CCCCCC" w:sz="1"/>
+                <w:bottom w:val="single" w:color="CCCCCC" w:sz="1"/>
+                <w:right w:val="single" w:color="CCCCCC" w:sz="1"/>
+              </w:tcBorders>
+              <w:tcMar>
+                <w:top w:type="dxa" w:w="80"/>
+                <w:left w:type="dxa" w:w="120"/>
+                <w:bottom w:type="dxa" w:w="80"/>
+                <w:right w:type="dxa" w:w="120"/>
+              </w:tcMar>
+            </w:tcPr>
+            <w:p>
+              <w:r>
+                <w:rPr>
+                  <w:rFonts w:ascii="Arial" w:cs="Arial" w:eastAsia="Arial" w:hAnsi="Arial"/>
+                  <w:sz w:val="20"/>
+                  <w:szCs w:val="20"/>
+                </w:rPr>
+                <w:t xml:space="preserve"/>
+              </w:r>
+            </w:p>
+          </w:tc>
+          <w:tc>
+            <w:tcPr>
+              <w:tcW w:type="dxa" w:w="1760"/>
+              <w:tcBorders>
+                <w:top w:val="single" w:color="CCCCCC" w:sz="1"/>
+                <w:left w:val="single" w:color="CCCCCC" w:sz="1"/>
+                <w:bottom w:val="single" w:color="CCCCCC" w:sz="1"/>
+                <w:right w:val="single" w:color="CCCCCC" w:sz="1"/>
+              </w:tcBorders>
+              <w:tcMar>
+                <w:top w:type="dxa" w:w="80"/>
+                <w:left w:type="dxa" w:w="120"/>
+                <w:bottom w:type="dxa" w:w="80"/>
+                <w:right w:type="dxa" w:w="120"/>
+              </w:tcMar>
+            </w:tcPr>
+            <w:p>
+              <w:r>
+                <w:rPr>
+                  <w:rFonts w:ascii="Arial" w:cs="Arial" w:eastAsia="Arial" w:hAnsi="Arial"/>
+                  <w:sz w:val="20"/>
+                  <w:szCs w:val="20"/>
+                </w:rPr>
+                <w:t xml:space="preserve"/>
+              </w:r>
+            </w:p>
+          </w:tc>
+          <w:tc>
+            <w:tcPr>
+              <w:tcW w:type="dxa" w:w="1760"/>
+              <w:tcBorders>
+                <w:top w:val="single" w:color="CCCCCC" w:sz="1"/>
+                <w:left w:val="single" w:color="CCCCCC" w:sz="1"/>
+                <w:bottom w:val="single" w:color="CCCCCC" w:sz="1"/>
+                <w:right w:val="single" w:color="CCCCCC" w:sz="1"/>
+              </w:tcBorders>
+              <w:tcMar>
+                <w:top w:type="dxa" w:w="80"/>
+                <w:left w:type="dxa" w:w="120"/>
+                <w:bottom w:type="dxa" w:w="80"/>
+                <w:right w:type="dxa" w:w="120"/>
+              </w:tcMar>
+            </w:tcPr>
+            <w:p>
+              <w:r>
+                <w:rPr>
+                  <w:rFonts w:ascii="Arial" w:cs="Arial" w:eastAsia="Arial" w:hAnsi="Arial"/>
+                  <w:sz w:val="20"/>
+                  <w:szCs w:val="20"/>
+                </w:rPr>
+                <w:t xml:space="preserve"/>
+              </w:r>
+            </w:p>
+          </w:tc>
+          <w:tc>
+            <w:tcPr>
+              <w:tcW w:type="dxa" w:w="1760"/>
+              <w:tcBorders>
+                <w:top w:val="single" w:color="CCCCCC" w:sz="1"/>
+                <w:left w:val="single" w:color="CCCCCC" w:sz="1"/>
+                <w:bottom w:val="single" w:color="CCCCCC" w:sz="1"/>
+                <w:right w:val="single" w:color="CCCCCC" w:sz="1"/>
+              </w:tcBorders>
+              <w:tcMar>
+                <w:top w:type="dxa" w:w="80"/>
+                <w:left w:type="dxa" w:w="120"/>
+                <w:bottom w:type="dxa" w:w="80"/>
+                <w:right w:type="dxa" w:w="120"/>
+              </w:tcMar>
+            </w:tcPr>
+            <w:p>
+              <w:r>
+                <w:rPr>
+                  <w:rFonts w:ascii="Arial" w:cs="Arial" w:eastAsia="Arial" w:hAnsi="Arial"/>
+                  <w:sz w:val="20"/>
+                  <w:szCs w:val="20"/>
+                </w:rPr>
+                <w:t xml:space="preserve"/>
+              </w:r>
+            </w:p>
+          </w:tc>
+        </w:tr>
+      </w:tbl>
+      <w:p>
+        <w:pPr>
+          <w:spacing w:before="0" w:after="80"/>
+        </w:pPr>
+        <w:r>
+          <w:t xml:space="preserve"/>
+        </w:r>
+      </w:p>
     </w:sectPr>
   </w:body>
 </w:document>
 </file>
 
-<file path=word/comments.xml><?xml version="1.0" encoding="utf-8"?>
-<w:comments xmlns:cx="http://schemas.microsoft.com/office/drawing/2014/chartex" xmlns:cx1="http://schemas.microsoft.com/office/drawing/2015/9/8/chartex" xmlns:cx2="http://schemas.microsoft.com/office/drawing/2015/10/21/chartex" xmlns:cx3="http://schemas.microsoft.com/office/drawing/2016/5/9/chartex" xmlns:cx4="http://schemas.microsoft.com/office/drawing/2016/5/10/chartex" xmlns:cx5="http://schemas.microsoft.com/office/drawing/2016/5/11/chartex" xmlns:cx6="http://schemas.microsoft.com/office/drawing/2016/5/12/chartex" xmlns:cx7="http://schemas.microsoft.com/office/drawing/2016/5/13/chartex" xmlns:cx8="http://schemas.microsoft.com/office/drawing/2016/5/14/chartex" xmlns:mc="http://schemas.openxmlformats.org/markup-compatibility/2006" xmlns:aink="http://schemas.microsoft.com/office/drawing/2016/ink" xmlns:am3d="http://schemas.microsoft.com/office/drawing/2017/model3d" xmlns:o="urn:schemas-microsoft-com:office:office" xmlns:r="http://schemas.openxmlformats.org/officeDocument/2006/relationships" xmlns:m="http://schemas.openxmlformats.org/officeDocument/2006/math" xmlns:v="urn:schemas-microsoft-com:vml" xmlns:wp14="http://schemas.microsoft.com/office/word/2010/wordprocessingDrawing" xmlns:wp="http://schemas.openxmlformats.org/drawingml/2006/wordprocessingDrawing" xmlns:w10="urn:schemas-microsoft-com:office:word" xmlns:w="http://schemas.openxmlformats.org/wordprocessingml/2006/main" xmlns:w14="http://schemas.microsoft.com/office/word/2010/wordml" xmlns:w15="http://schemas.microsoft.com/office/word/2012/wordml" xmlns:w16cex="http://schemas.microsoft.com/office/word/2018/wordml/cex" xmlns:w16cid="http://schemas.microsoft.com/office/word/2016/wordml/cid" xmlns:w16="http://schemas.microsoft.com/office/word/2018/wordml" xmlns:w16sdtdh="http://schemas.microsoft.com/office/word/2020/wordml/sdtdatahash" xmlns:w16se="http://schemas.microsoft.com/office/word/2015/wordml/symex" xmlns:wpg="http://schemas.microsoft.com/office/word/2010/wordprocessingGroup" xmlns:wpi="http://schemas.microsoft.com/office/word/2010/wordprocessingInk" xmlns:wne="http://schemas.microsoft.com/office/word/2006/wordml" xmlns:wps="http://schemas.microsoft.com/office/word/2010/wordprocessingShape"/>
+<file path=word\fontTable.xml><?xml version="1.0" encoding="utf-8"?>
+<w:fonts xmlns:mc="http://schemas.openxmlformats.org/markup-compatibility/2006" xmlns:r="http://schemas.openxmlformats.org/officeDocument/2006/relationships" xmlns:w="http://schemas.openxmlformats.org/wordprocessingml/2006/main" xmlns:w14="http://schemas.microsoft.com/office/word/2010/wordml" xmlns:w15="http://schemas.microsoft.com/office/word/2012/wordml" xmlns:w16cex="http://schemas.microsoft.com/office/word/2018/wordml/cex" xmlns:w16cid="http://schemas.microsoft.com/office/word/2016/wordml/cid" xmlns:w16="http://schemas.microsoft.com/office/word/2018/wordml" xmlns:w16sdtdh="http://schemas.microsoft.com/office/word/2020/wordml/sdtdatahash" xmlns:w16se="http://schemas.microsoft.com/office/word/2015/wordml/symex" mc:Ignorable="w14 w15 w16se w16cid w16 w16cex w16sdtdh"/>
 </file>
 
-<file path=word/footnotes.xml><?xml version="1.0" encoding="utf-8"?>
+<file path=word\footnotes.xml><?xml version="1.0" encoding="utf-8"?>
 <w:footnotes xmlns:wpc="http://schemas.microsoft.com/office/word/2010/wordprocessingCanvas" xmlns:mc="http://schemas.openxmlformats.org/markup-compatibility/2006" xmlns:o="urn:schemas-microsoft-com:office:office" xmlns:r="http://schemas.openxmlformats.org/officeDocument/2006/relationships" xmlns:m="http://schemas.openxmlformats.org/officeDocument/2006/math" xmlns:v="urn:schemas-microsoft-com:vml" xmlns:wp14="http://schemas.microsoft.com/office/word/2010/wordprocessingDrawing" xmlns:wp="http://schemas.openxmlformats.org/drawingml/2006/wordprocessingDrawing" xmlns:w10="urn:schemas-microsoft-com:office:word" xmlns:w="http://schemas.openxmlformats.org/wordprocessingml/2006/main" xmlns:w14="http://schemas.microsoft.com/office/word/2010/wordml" xmlns:w15="http://schemas.microsoft.com/office/word/2012/wordml" xmlns:wpg="http://schemas.microsoft.com/office/word/2010/wordprocessingGroup" xmlns:wpi="http://schemas.microsoft.com/office/word/2010/wordprocessingInk" xmlns:wne="http://schemas.microsoft.com/office/word/2006/wordml" xmlns:wps="http://schemas.microsoft.com/office/word/2010/wordprocessingShape" mc:Ignorable="w14 w15 wp14">
   <w:footnote w:type="separator" w:id="-1">
     <w:p>
@@ -9681,7 +10954,7 @@
 </w:footnotes>
 </file>
 
-<file path=word/numbering.xml><?xml version="1.0" encoding="utf-8"?>
+<file path=word\numbering.xml><?xml version="1.0" encoding="utf-8"?>
 <w:numbering xmlns:wpc="http://schemas.microsoft.com/office/word/2010/wordprocessingCanvas" xmlns:mc="http://schemas.openxmlformats.org/markup-compatibility/2006" xmlns:o="urn:schemas-microsoft-com:office:office" xmlns:r="http://schemas.openxmlformats.org/officeDocument/2006/relationships" xmlns:m="http://schemas.openxmlformats.org/officeDocument/2006/math" xmlns:v="urn:schemas-microsoft-com:vml" xmlns:wp14="http://schemas.microsoft.com/office/word/2010/wordprocessingDrawing" xmlns:wp="http://schemas.openxmlformats.org/drawingml/2006/wordprocessingDrawing" xmlns:w10="urn:schemas-microsoft-com:office:word" xmlns:w="http://schemas.openxmlformats.org/wordprocessingml/2006/main" xmlns:w14="http://schemas.microsoft.com/office/word/2010/wordml" xmlns:w15="http://schemas.microsoft.com/office/word/2012/wordml" xmlns:wpg="http://schemas.microsoft.com/office/word/2010/wordprocessingGroup" xmlns:wpi="http://schemas.microsoft.com/office/word/2010/wordprocessingInk" xmlns:wne="http://schemas.microsoft.com/office/word/2006/wordml" xmlns:wps="http://schemas.microsoft.com/office/word/2010/wordprocessingShape" mc:Ignorable="w14 w15 wp14">
   <w:abstractNum w:abstractNumId="1" w15:restartNumberingAfterBreak="0">
     <w:multiLevelType w:val="hybridMultilevel"/>
@@ -9799,7 +11072,17 @@
 </w:numbering>
 </file>
 
-<file path=word/styles.xml><?xml version="1.0" encoding="utf-8"?>
+<file path=word\settings.xml><?xml version="1.0" encoding="utf-8"?>
+<w:settings xmlns:wpc="http://schemas.microsoft.com/office/word/2010/wordprocessingCanvas" xmlns:mc="http://schemas.openxmlformats.org/markup-compatibility/2006" xmlns:o="urn:schemas-microsoft-com:office:office" xmlns:r="http://schemas.openxmlformats.org/officeDocument/2006/relationships" xmlns:m="http://schemas.openxmlformats.org/officeDocument/2006/math" xmlns:v="urn:schemas-microsoft-com:vml" xmlns:wp14="http://schemas.microsoft.com/office/word/2010/wordprocessingDrawing" xmlns:wp="http://schemas.openxmlformats.org/drawingml/2006/wordprocessingDrawing" xmlns:w10="urn:schemas-microsoft-com:office:word" xmlns:w="http://schemas.openxmlformats.org/wordprocessingml/2006/main" xmlns:w14="http://schemas.microsoft.com/office/word/2010/wordml" xmlns:w15="http://schemas.microsoft.com/office/word/2012/wordml" xmlns:wpg="http://schemas.microsoft.com/office/word/2010/wordprocessingGroup" xmlns:wpi="http://schemas.microsoft.com/office/word/2010/wordprocessingInk" xmlns:wne="http://schemas.microsoft.com/office/word/2006/wordml" xmlns:wps="http://schemas.microsoft.com/office/word/2010/wordprocessingShape" mc:Ignorable="w14 w15 wp14">
+  <w:displayBackgroundShape/>
+  <w:evenAndOddHeaders w:val="false"/>
+  <w:compat>
+    <w:compatSetting w:val="15" w:uri="http://schemas.microsoft.com/office/word" w:name="compatibilityMode"/>
+  </w:compat>
+</w:settings>
+</file>
+
+<file path=word\styles.xml><?xml version="1.0" encoding="utf-8"?>
 <w:styles xmlns:mc="http://schemas.openxmlformats.org/markup-compatibility/2006" xmlns:r="http://schemas.openxmlformats.org/officeDocument/2006/relationships" xmlns:w="http://schemas.openxmlformats.org/wordprocessingml/2006/main" xmlns:w14="http://schemas.microsoft.com/office/word/2010/wordml" xmlns:w15="http://schemas.microsoft.com/office/word/2012/wordml" mc:Ignorable="w14 w15">
   <w:docDefaults>
     <w:rPrDefault>

</xml_diff>